<commit_message>
cleaned up t tests on stats vignettes
</commit_message>
<xml_diff>
--- a/docs/ecostats_stat_overview/01_two_sample_ttest.docx
+++ b/docs/ecostats_stat_overview/01_two_sample_ttest.docx
@@ -4254,6 +4254,15 @@
         <w:t xml:space="preserve"> </w:t>
       </w:r>
       <w:r>
+        <w:br/>
+      </w:r>
+      <w:r>
+        <w:rPr>
+          <w:rStyle w:val="NormalTok"/>
+        </w:rPr>
+        <w:t xml:space="preserve">              </w:t>
+      </w:r>
+      <w:r>
         <w:rPr>
           <w:rStyle w:val="FunctionTok"/>
         </w:rPr>
@@ -4359,16 +4368,7 @@
         <w:rPr>
           <w:rStyle w:val="NormalTok"/>
         </w:rPr>
-        <w:t xml:space="preserve">)</w:t>
-      </w:r>
-      <w:r>
-        <w:br/>
-      </w:r>
-      <w:r>
-        <w:rPr>
-          <w:rStyle w:val="NormalTok"/>
-        </w:rPr>
-        <w:t xml:space="preserve">            )</w:t>
+        <w:t xml:space="preserve">))</w:t>
       </w:r>
       <w:r>
         <w:br/>
@@ -5501,7 +5501,19 @@
         <w:rPr>
           <w:rStyle w:val="NormalTok"/>
         </w:rPr>
-        <w:t xml:space="preserve">sculpin_df </w:t>
+        <w:t xml:space="preserve">sculpin_histo_plot </w:t>
+      </w:r>
+      <w:r>
+        <w:rPr>
+          <w:rStyle w:val="OtherTok"/>
+        </w:rPr>
+        <w:t xml:space="preserve">&lt;-</w:t>
+      </w:r>
+      <w:r>
+        <w:rPr>
+          <w:rStyle w:val="NormalTok"/>
+        </w:rPr>
+        <w:t xml:space="preserve"> sculpin_df </w:t>
       </w:r>
       <w:r>
         <w:rPr>
@@ -6123,6 +6135,15 @@
           <w:rStyle w:val="NormalTok"/>
         </w:rPr>
         <w:t xml:space="preserve">  ) </w:t>
+      </w:r>
+      <w:r>
+        <w:br/>
+      </w:r>
+      <w:r>
+        <w:rPr>
+          <w:rStyle w:val="NormalTok"/>
+        </w:rPr>
+        <w:t xml:space="preserve">sculpin_histo_plot</w:t>
       </w:r>
     </w:p>
     <w:p>
@@ -7013,7 +7034,7 @@
     <w:bookmarkEnd w:id="35"/>
     <w:bookmarkEnd w:id="36"/>
     <w:bookmarkEnd w:id="37"/>
-    <w:bookmarkStart w:id="54" w:name="testing-t-test-assumptions"/>
+    <w:bookmarkStart w:id="55" w:name="testing-t-test-assumptions"/>
     <w:p>
       <w:pPr>
         <w:pStyle w:val="Heading1"/>
@@ -7036,7 +7057,7 @@
         <w:t xml:space="preserve">underlying assumptions:</w:t>
       </w:r>
     </w:p>
-    <w:bookmarkStart w:id="52" w:name="assumptions-of-the-two-sample-t-test"/>
+    <w:bookmarkStart w:id="53" w:name="assumptions-of-the-two-sample-t-test"/>
     <w:p>
       <w:pPr>
         <w:pStyle w:val="Heading2"/>
@@ -7219,141 +7240,7 @@
         <w:rPr>
           <w:rStyle w:val="NormalTok"/>
         </w:rPr>
-        <w:t xml:space="preserve">sculpin_df </w:t>
-      </w:r>
-      <w:r>
-        <w:rPr>
-          <w:rStyle w:val="SpecialCharTok"/>
-        </w:rPr>
-        <w:t xml:space="preserve">%&gt;%</w:t>
-      </w:r>
-      <w:r>
-        <w:rPr>
-          <w:rStyle w:val="NormalTok"/>
-        </w:rPr>
-        <w:t xml:space="preserve"> </w:t>
-      </w:r>
-      <w:r>
-        <w:br/>
-      </w:r>
-      <w:r>
-        <w:rPr>
-          <w:rStyle w:val="NormalTok"/>
-        </w:rPr>
-        <w:t xml:space="preserve">  </w:t>
-      </w:r>
-      <w:r>
-        <w:rPr>
-          <w:rStyle w:val="FunctionTok"/>
-        </w:rPr>
-        <w:t xml:space="preserve">ggplot</w:t>
-      </w:r>
-      <w:r>
-        <w:rPr>
-          <w:rStyle w:val="NormalTok"/>
-        </w:rPr>
-        <w:t xml:space="preserve">(</w:t>
-      </w:r>
-      <w:r>
-        <w:rPr>
-          <w:rStyle w:val="FunctionTok"/>
-        </w:rPr>
-        <w:t xml:space="preserve">aes</w:t>
-      </w:r>
-      <w:r>
-        <w:rPr>
-          <w:rStyle w:val="NormalTok"/>
-        </w:rPr>
-        <w:t xml:space="preserve">(length_mm, </w:t>
-      </w:r>
-      <w:r>
-        <w:rPr>
-          <w:rStyle w:val="AttributeTok"/>
-        </w:rPr>
-        <w:t xml:space="preserve">fill =</w:t>
-      </w:r>
-      <w:r>
-        <w:rPr>
-          <w:rStyle w:val="NormalTok"/>
-        </w:rPr>
-        <w:t xml:space="preserve"> lake))</w:t>
-      </w:r>
-      <w:r>
-        <w:rPr>
-          <w:rStyle w:val="SpecialCharTok"/>
-        </w:rPr>
-        <w:t xml:space="preserve">+</w:t>
-      </w:r>
-      <w:r>
-        <w:br/>
-      </w:r>
-      <w:r>
-        <w:rPr>
-          <w:rStyle w:val="NormalTok"/>
-        </w:rPr>
-        <w:t xml:space="preserve">  </w:t>
-      </w:r>
-      <w:r>
-        <w:rPr>
-          <w:rStyle w:val="FunctionTok"/>
-        </w:rPr>
-        <w:t xml:space="preserve">geom_histogram</w:t>
-      </w:r>
-      <w:r>
-        <w:rPr>
-          <w:rStyle w:val="NormalTok"/>
-        </w:rPr>
-        <w:t xml:space="preserve">()</w:t>
-      </w:r>
-      <w:r>
-        <w:rPr>
-          <w:rStyle w:val="SpecialCharTok"/>
-        </w:rPr>
-        <w:t xml:space="preserve">+</w:t>
-      </w:r>
-      <w:r>
-        <w:br/>
-      </w:r>
-      <w:r>
-        <w:rPr>
-          <w:rStyle w:val="NormalTok"/>
-        </w:rPr>
-        <w:t xml:space="preserve">  </w:t>
-      </w:r>
-      <w:r>
-        <w:rPr>
-          <w:rStyle w:val="FunctionTok"/>
-        </w:rPr>
-        <w:t xml:space="preserve">facet_wrap</w:t>
-      </w:r>
-      <w:r>
-        <w:rPr>
-          <w:rStyle w:val="NormalTok"/>
-        </w:rPr>
-        <w:t xml:space="preserve">(</w:t>
-      </w:r>
-      <w:r>
-        <w:rPr>
-          <w:rStyle w:val="SpecialCharTok"/>
-        </w:rPr>
-        <w:t xml:space="preserve">~</w:t>
-      </w:r>
-      <w:r>
-        <w:rPr>
-          <w:rStyle w:val="NormalTok"/>
-        </w:rPr>
-        <w:t xml:space="preserve">lake)</w:t>
-      </w:r>
-    </w:p>
-    <w:p>
-      <w:pPr>
-        <w:pStyle w:val="SourceCode"/>
-      </w:pPr>
-      <w:r>
-        <w:rPr>
-          <w:rStyle w:val="VerbatimChar"/>
-        </w:rPr>
-        <w:t xml:space="preserve">`stat_bin()` using `bins = 30`. Pick better value with `binwidth`.</w:t>
+        <w:t xml:space="preserve">sculpin_histo_plot</w:t>
       </w:r>
     </w:p>
     <w:p>
@@ -7363,14 +7250,14 @@
       <w:r>
         <w:drawing>
           <wp:inline>
-            <wp:extent cx="6096000" cy="6096000"/>
+            <wp:extent cx="3657600" cy="4876800"/>
             <wp:effectExtent b="0" l="0" r="0" t="0"/>
             <wp:docPr descr="" title="" id="40" name="Picture"/>
             <a:graphic>
               <a:graphicData uri="http://schemas.openxmlformats.org/drawingml/2006/picture">
                 <pic:pic>
                   <pic:nvPicPr>
-                    <pic:cNvPr descr="01_two_sample_ttest_files/figure-docx/unnamed-chunk-6-1.png" id="41" name="Picture"/>
+                    <pic:cNvPr descr="01_two_sample_ttest_files/figure-docx/sculpin_histo_2-1.png" id="41" name="Picture"/>
                     <pic:cNvPicPr>
                       <a:picLocks noChangeArrowheads="1" noChangeAspect="1"/>
                     </pic:cNvPicPr>
@@ -7384,7 +7271,7 @@
                   <pic:spPr bwMode="auto">
                     <a:xfrm>
                       <a:off x="0" y="0"/>
-                      <a:ext cx="6096000" cy="6096000"/>
+                      <a:ext cx="3657600" cy="4876800"/>
                     </a:xfrm>
                     <a:prstGeom prst="rect">
                       <a:avLst/>
@@ -7802,7 +7689,7 @@
               <a:graphicData uri="http://schemas.openxmlformats.org/drawingml/2006/picture">
                 <pic:pic>
                   <pic:nvPicPr>
-                    <pic:cNvPr descr="01_two_sample_ttest_files/figure-docx/unnamed-chunk-7-1.png" id="46" name="Picture"/>
+                    <pic:cNvPr descr="01_two_sample_ttest_files/figure-docx/unnamed-chunk-6-1.png" id="46" name="Picture"/>
                     <pic:cNvPicPr>
                       <a:picLocks noChangeArrowheads="1" noChangeAspect="1"/>
                     </pic:cNvPicPr>
@@ -8368,6 +8255,320 @@
         <w:rPr>
           <w:rStyle w:val="NormalTok"/>
         </w:rPr>
+        <w:t xml:space="preserve">normality_results </w:t>
+      </w:r>
+      <w:r>
+        <w:rPr>
+          <w:rStyle w:val="OtherTok"/>
+        </w:rPr>
+        <w:t xml:space="preserve">&lt;-</w:t>
+      </w:r>
+      <w:r>
+        <w:rPr>
+          <w:rStyle w:val="NormalTok"/>
+        </w:rPr>
+        <w:t xml:space="preserve"> sculpin_df </w:t>
+      </w:r>
+      <w:r>
+        <w:rPr>
+          <w:rStyle w:val="SpecialCharTok"/>
+        </w:rPr>
+        <w:t xml:space="preserve">%&gt;%</w:t>
+      </w:r>
+      <w:r>
+        <w:br/>
+      </w:r>
+      <w:r>
+        <w:rPr>
+          <w:rStyle w:val="NormalTok"/>
+        </w:rPr>
+        <w:t xml:space="preserve">  </w:t>
+      </w:r>
+      <w:r>
+        <w:rPr>
+          <w:rStyle w:val="FunctionTok"/>
+        </w:rPr>
+        <w:t xml:space="preserve">group_by</w:t>
+      </w:r>
+      <w:r>
+        <w:rPr>
+          <w:rStyle w:val="NormalTok"/>
+        </w:rPr>
+        <w:t xml:space="preserve">(lake) </w:t>
+      </w:r>
+      <w:r>
+        <w:rPr>
+          <w:rStyle w:val="SpecialCharTok"/>
+        </w:rPr>
+        <w:t xml:space="preserve">%&gt;%</w:t>
+      </w:r>
+      <w:r>
+        <w:br/>
+      </w:r>
+      <w:r>
+        <w:rPr>
+          <w:rStyle w:val="NormalTok"/>
+        </w:rPr>
+        <w:t xml:space="preserve">  </w:t>
+      </w:r>
+      <w:r>
+        <w:rPr>
+          <w:rStyle w:val="FunctionTok"/>
+        </w:rPr>
+        <w:t xml:space="preserve">summarize</w:t>
+      </w:r>
+      <w:r>
+        <w:rPr>
+          <w:rStyle w:val="NormalTok"/>
+        </w:rPr>
+        <w:t xml:space="preserve">(</w:t>
+      </w:r>
+      <w:r>
+        <w:br/>
+      </w:r>
+      <w:r>
+        <w:rPr>
+          <w:rStyle w:val="NormalTok"/>
+        </w:rPr>
+        <w:t xml:space="preserve">    </w:t>
+      </w:r>
+      <w:r>
+        <w:rPr>
+          <w:rStyle w:val="AttributeTok"/>
+        </w:rPr>
+        <w:t xml:space="preserve">shapiro_stat =</w:t>
+      </w:r>
+      <w:r>
+        <w:rPr>
+          <w:rStyle w:val="NormalTok"/>
+        </w:rPr>
+        <w:t xml:space="preserve"> </w:t>
+      </w:r>
+      <w:r>
+        <w:rPr>
+          <w:rStyle w:val="FunctionTok"/>
+        </w:rPr>
+        <w:t xml:space="preserve">shapiro.test</w:t>
+      </w:r>
+      <w:r>
+        <w:rPr>
+          <w:rStyle w:val="NormalTok"/>
+        </w:rPr>
+        <w:t xml:space="preserve">(length_mm)</w:t>
+      </w:r>
+      <w:r>
+        <w:rPr>
+          <w:rStyle w:val="SpecialCharTok"/>
+        </w:rPr>
+        <w:t xml:space="preserve">$</w:t>
+      </w:r>
+      <w:r>
+        <w:rPr>
+          <w:rStyle w:val="NormalTok"/>
+        </w:rPr>
+        <w:t xml:space="preserve">statistic,</w:t>
+      </w:r>
+      <w:r>
+        <w:br/>
+      </w:r>
+      <w:r>
+        <w:rPr>
+          <w:rStyle w:val="NormalTok"/>
+        </w:rPr>
+        <w:t xml:space="preserve">    </w:t>
+      </w:r>
+      <w:r>
+        <w:rPr>
+          <w:rStyle w:val="AttributeTok"/>
+        </w:rPr>
+        <w:t xml:space="preserve">shapiro_p_value =</w:t>
+      </w:r>
+      <w:r>
+        <w:rPr>
+          <w:rStyle w:val="NormalTok"/>
+        </w:rPr>
+        <w:t xml:space="preserve"> </w:t>
+      </w:r>
+      <w:r>
+        <w:rPr>
+          <w:rStyle w:val="FunctionTok"/>
+        </w:rPr>
+        <w:t xml:space="preserve">shapiro.test</w:t>
+      </w:r>
+      <w:r>
+        <w:rPr>
+          <w:rStyle w:val="NormalTok"/>
+        </w:rPr>
+        <w:t xml:space="preserve">(length_mm)</w:t>
+      </w:r>
+      <w:r>
+        <w:rPr>
+          <w:rStyle w:val="SpecialCharTok"/>
+        </w:rPr>
+        <w:t xml:space="preserve">$</w:t>
+      </w:r>
+      <w:r>
+        <w:rPr>
+          <w:rStyle w:val="NormalTok"/>
+        </w:rPr>
+        <w:t xml:space="preserve">p.value,</w:t>
+      </w:r>
+      <w:r>
+        <w:br/>
+      </w:r>
+      <w:r>
+        <w:rPr>
+          <w:rStyle w:val="NormalTok"/>
+        </w:rPr>
+        <w:t xml:space="preserve">    </w:t>
+      </w:r>
+      <w:r>
+        <w:rPr>
+          <w:rStyle w:val="AttributeTok"/>
+        </w:rPr>
+        <w:t xml:space="preserve">normal_distribution =</w:t>
+      </w:r>
+      <w:r>
+        <w:rPr>
+          <w:rStyle w:val="NormalTok"/>
+        </w:rPr>
+        <w:t xml:space="preserve"> </w:t>
+      </w:r>
+      <w:r>
+        <w:rPr>
+          <w:rStyle w:val="FunctionTok"/>
+        </w:rPr>
+        <w:t xml:space="preserve">if_else</w:t>
+      </w:r>
+      <w:r>
+        <w:rPr>
+          <w:rStyle w:val="NormalTok"/>
+        </w:rPr>
+        <w:t xml:space="preserve">(shapiro_p_value </w:t>
+      </w:r>
+      <w:r>
+        <w:rPr>
+          <w:rStyle w:val="SpecialCharTok"/>
+        </w:rPr>
+        <w:t xml:space="preserve">&gt;</w:t>
+      </w:r>
+      <w:r>
+        <w:rPr>
+          <w:rStyle w:val="NormalTok"/>
+        </w:rPr>
+        <w:t xml:space="preserve"> </w:t>
+      </w:r>
+      <w:r>
+        <w:rPr>
+          <w:rStyle w:val="FloatTok"/>
+        </w:rPr>
+        <w:t xml:space="preserve">0.05</w:t>
+      </w:r>
+      <w:r>
+        <w:rPr>
+          <w:rStyle w:val="NormalTok"/>
+        </w:rPr>
+        <w:t xml:space="preserve">, </w:t>
+      </w:r>
+      <w:r>
+        <w:rPr>
+          <w:rStyle w:val="StringTok"/>
+        </w:rPr>
+        <w:t xml:space="preserve">"Normal"</w:t>
+      </w:r>
+      <w:r>
+        <w:rPr>
+          <w:rStyle w:val="NormalTok"/>
+        </w:rPr>
+        <w:t xml:space="preserve">, </w:t>
+      </w:r>
+      <w:r>
+        <w:rPr>
+          <w:rStyle w:val="StringTok"/>
+        </w:rPr>
+        <w:t xml:space="preserve">"Non-normal"</w:t>
+      </w:r>
+      <w:r>
+        <w:rPr>
+          <w:rStyle w:val="NormalTok"/>
+        </w:rPr>
+        <w:t xml:space="preserve">))</w:t>
+      </w:r>
+      <w:r>
+        <w:br/>
+      </w:r>
+      <w:r>
+        <w:rPr>
+          <w:rStyle w:val="NormalTok"/>
+        </w:rPr>
+        <w:t xml:space="preserve">normality_results</w:t>
+      </w:r>
+    </w:p>
+    <w:p>
+      <w:pPr>
+        <w:pStyle w:val="SourceCode"/>
+      </w:pPr>
+      <w:r>
+        <w:rPr>
+          <w:rStyle w:val="VerbatimChar"/>
+        </w:rPr>
+        <w:t xml:space="preserve"># A tibble: 2 × 4</w:t>
+      </w:r>
+      <w:r>
+        <w:br/>
+      </w:r>
+      <w:r>
+        <w:rPr>
+          <w:rStyle w:val="VerbatimChar"/>
+        </w:rPr>
+        <w:t xml:space="preserve">  lake  shapiro_stat shapiro_p_value normal_distribution</w:t>
+      </w:r>
+      <w:r>
+        <w:br/>
+      </w:r>
+      <w:r>
+        <w:rPr>
+          <w:rStyle w:val="VerbatimChar"/>
+        </w:rPr>
+        <w:t xml:space="preserve">  &lt;chr&gt;        &lt;dbl&gt;           &lt;dbl&gt; &lt;chr&gt;              </w:t>
+      </w:r>
+      <w:r>
+        <w:br/>
+      </w:r>
+      <w:r>
+        <w:rPr>
+          <w:rStyle w:val="VerbatimChar"/>
+        </w:rPr>
+        <w:t xml:space="preserve">1 NE 14        0.948          0.0826 Normal             </w:t>
+      </w:r>
+      <w:r>
+        <w:br/>
+      </w:r>
+      <w:r>
+        <w:rPr>
+          <w:rStyle w:val="VerbatimChar"/>
+        </w:rPr>
+        <w:t xml:space="preserve">2 S 07         0.980          0.313  Normal             </w:t>
+      </w:r>
+    </w:p>
+    <w:bookmarkEnd w:id="50"/>
+    <w:bookmarkStart w:id="51" w:name="nicer-way-3"/>
+    <w:p>
+      <w:pPr>
+        <w:pStyle w:val="Heading3"/>
+      </w:pPr>
+      <w:r>
+        <w:t xml:space="preserve">nicer way #3</w:t>
+      </w:r>
+    </w:p>
+    <w:p>
+      <w:pPr>
+        <w:pStyle w:val="SourceCode"/>
+      </w:pPr>
+      <w:r>
+        <w:rPr>
+          <w:rStyle w:val="NormalTok"/>
+        </w:rPr>
         <w:t xml:space="preserve">sculpin_df </w:t>
       </w:r>
       <w:r>
@@ -8718,8 +8919,8 @@
         <w:t xml:space="preserve">W = 0.98035, p-value = 0.3125</w:t>
       </w:r>
     </w:p>
-    <w:bookmarkEnd w:id="50"/>
-    <w:bookmarkStart w:id="51" w:name="homogeneity-of-variances"/>
+    <w:bookmarkEnd w:id="51"/>
+    <w:bookmarkStart w:id="52" w:name="homogeneity-of-variances"/>
     <w:p>
       <w:pPr>
         <w:pStyle w:val="Heading3"/>
@@ -8733,281 +8934,203 @@
         <w:pStyle w:val="FirstParagraph"/>
       </w:pPr>
       <w:r>
-        <w:t xml:space="preserve">We’ll check for homogeneity of variances using: - Visual inspection of</w:t>
-      </w:r>
-      <w:r>
-        <w:t xml:space="preserve"> </w:t>
-      </w:r>
-      <w:r>
-        <w:t xml:space="preserve">boxplots (already done above) - Levene’s test</w:t>
-      </w:r>
-    </w:p>
-    <w:p>
-      <w:pPr>
-        <w:pStyle w:val="SourceCode"/>
-      </w:pPr>
-      <w:r>
-        <w:rPr>
-          <w:rStyle w:val="CommentTok"/>
-        </w:rPr>
-        <w:t xml:space="preserve"># Levene's test for homogeneity of variances</w:t>
-      </w:r>
-      <w:r>
-        <w:br/>
-      </w:r>
-      <w:r>
-        <w:rPr>
-          <w:rStyle w:val="FunctionTok"/>
-        </w:rPr>
-        <w:t xml:space="preserve">leveneTest</w:t>
-      </w:r>
-      <w:r>
-        <w:rPr>
-          <w:rStyle w:val="NormalTok"/>
-        </w:rPr>
-        <w:t xml:space="preserve">(length_mm </w:t>
-      </w:r>
-      <w:r>
-        <w:rPr>
-          <w:rStyle w:val="SpecialCharTok"/>
-        </w:rPr>
-        <w:t xml:space="preserve">~</w:t>
-      </w:r>
-      <w:r>
-        <w:rPr>
-          <w:rStyle w:val="NormalTok"/>
-        </w:rPr>
-        <w:t xml:space="preserve"> lake, </w:t>
-      </w:r>
-      <w:r>
-        <w:rPr>
-          <w:rStyle w:val="AttributeTok"/>
-        </w:rPr>
-        <w:t xml:space="preserve">data =</w:t>
-      </w:r>
-      <w:r>
-        <w:rPr>
-          <w:rStyle w:val="NormalTok"/>
-        </w:rPr>
-        <w:t xml:space="preserve"> sculpin_df)</w:t>
-      </w:r>
-    </w:p>
-    <w:p>
-      <w:pPr>
-        <w:pStyle w:val="SourceCode"/>
-      </w:pPr>
-      <w:r>
-        <w:rPr>
-          <w:rStyle w:val="VerbatimChar"/>
-        </w:rPr>
-        <w:t xml:space="preserve">Warning in leveneTest.default(y = y, group = group, ...): group coerced to</w:t>
-      </w:r>
-      <w:r>
-        <w:br/>
-      </w:r>
-      <w:r>
-        <w:rPr>
-          <w:rStyle w:val="VerbatimChar"/>
-        </w:rPr>
-        <w:t xml:space="preserve">factor.</w:t>
-      </w:r>
-    </w:p>
-    <w:p>
-      <w:pPr>
-        <w:pStyle w:val="SourceCode"/>
-      </w:pPr>
-      <w:r>
-        <w:rPr>
-          <w:rStyle w:val="VerbatimChar"/>
-        </w:rPr>
-        <w:t xml:space="preserve">Levene's Test for Homogeneity of Variance (center = median)</w:t>
-      </w:r>
-      <w:r>
-        <w:br/>
-      </w:r>
-      <w:r>
-        <w:rPr>
-          <w:rStyle w:val="VerbatimChar"/>
-        </w:rPr>
-        <w:t xml:space="preserve">       Df F value Pr(&gt;F)</w:t>
-      </w:r>
-      <w:r>
-        <w:br/>
-      </w:r>
-      <w:r>
-        <w:rPr>
-          <w:rStyle w:val="VerbatimChar"/>
-        </w:rPr>
-        <w:t xml:space="preserve">group   1   2.029 0.1572</w:t>
-      </w:r>
-      <w:r>
-        <w:br/>
-      </w:r>
-      <w:r>
-        <w:rPr>
-          <w:rStyle w:val="VerbatimChar"/>
-        </w:rPr>
-        <w:t xml:space="preserve">      108               </w:t>
-      </w:r>
-    </w:p>
-    <w:bookmarkEnd w:id="51"/>
-    <w:bookmarkEnd w:id="52"/>
-    <w:bookmarkStart w:id="53" w:name="interpretation-of-assumption-tests"/>
-    <w:p>
-      <w:pPr>
-        <w:pStyle w:val="Heading2"/>
-      </w:pPr>
-      <w:r>
-        <w:t xml:space="preserve">Interpretation of Assumption Tests</w:t>
-      </w:r>
-    </w:p>
-    <w:p>
-      <w:pPr>
-        <w:pStyle w:val="FirstParagraph"/>
-      </w:pPr>
-      <w:r>
-        <w:t xml:space="preserve">Based on the results of our assumption tests:</w:t>
-      </w:r>
-    </w:p>
-    <w:p>
-      <w:pPr>
+        <w:t xml:space="preserve">We’ll check for homogeneity of variances using:</w:t>
+      </w:r>
+    </w:p>
+    <w:p>
+      <w:pPr>
+        <w:pStyle w:val="Compact"/>
         <w:numPr>
           <w:ilvl w:val="0"/>
           <w:numId w:val="1006"/>
         </w:numPr>
       </w:pPr>
       <w:r>
-        <w:rPr>
-          <w:b/>
-          <w:bCs/>
-        </w:rPr>
-        <w:t xml:space="preserve">Independence</w:t>
-      </w:r>
-      <w:r>
-        <w:t xml:space="preserve">: We assume this is met based on the data collection</w:t>
-      </w:r>
-      <w:r>
-        <w:t xml:space="preserve"> </w:t>
-      </w:r>
-      <w:r>
-        <w:t xml:space="preserve">process, as samples from each lake were collected independently of</w:t>
-      </w:r>
-      <w:r>
-        <w:t xml:space="preserve"> </w:t>
-      </w:r>
-      <w:r>
-        <w:t xml:space="preserve">one another.</w:t>
-      </w:r>
-    </w:p>
-    <w:p>
-      <w:pPr>
+        <w:t xml:space="preserve">Visual inspection of boxplots (already done above)</w:t>
+      </w:r>
+    </w:p>
+    <w:p>
+      <w:pPr>
+        <w:pStyle w:val="Compact"/>
         <w:numPr>
           <w:ilvl w:val="0"/>
           <w:numId w:val="1006"/>
         </w:numPr>
       </w:pPr>
       <w:r>
+        <w:t xml:space="preserve">Levene’s test</w:t>
+      </w:r>
+    </w:p>
+    <w:p>
+      <w:pPr>
+        <w:pStyle w:val="SourceCode"/>
+      </w:pPr>
+      <w:r>
+        <w:rPr>
+          <w:rStyle w:val="CommentTok"/>
+        </w:rPr>
+        <w:t xml:space="preserve"># Levene's test for homogeneity of variances</w:t>
+      </w:r>
+      <w:r>
+        <w:br/>
+      </w:r>
+      <w:r>
+        <w:rPr>
+          <w:rStyle w:val="FunctionTok"/>
+        </w:rPr>
+        <w:t xml:space="preserve">leveneTest</w:t>
+      </w:r>
+      <w:r>
+        <w:rPr>
+          <w:rStyle w:val="NormalTok"/>
+        </w:rPr>
+        <w:t xml:space="preserve">(length_mm </w:t>
+      </w:r>
+      <w:r>
+        <w:rPr>
+          <w:rStyle w:val="SpecialCharTok"/>
+        </w:rPr>
+        <w:t xml:space="preserve">~</w:t>
+      </w:r>
+      <w:r>
+        <w:rPr>
+          <w:rStyle w:val="NormalTok"/>
+        </w:rPr>
+        <w:t xml:space="preserve"> lake, </w:t>
+      </w:r>
+      <w:r>
+        <w:rPr>
+          <w:rStyle w:val="AttributeTok"/>
+        </w:rPr>
+        <w:t xml:space="preserve">data =</w:t>
+      </w:r>
+      <w:r>
+        <w:rPr>
+          <w:rStyle w:val="NormalTok"/>
+        </w:rPr>
+        <w:t xml:space="preserve"> sculpin_df)</w:t>
+      </w:r>
+    </w:p>
+    <w:p>
+      <w:pPr>
+        <w:pStyle w:val="SourceCode"/>
+      </w:pPr>
+      <w:r>
+        <w:rPr>
+          <w:rStyle w:val="VerbatimChar"/>
+        </w:rPr>
+        <w:t xml:space="preserve">Warning in leveneTest.default(y = y, group = group, ...): group coerced to</w:t>
+      </w:r>
+      <w:r>
+        <w:br/>
+      </w:r>
+      <w:r>
+        <w:rPr>
+          <w:rStyle w:val="VerbatimChar"/>
+        </w:rPr>
+        <w:t xml:space="preserve">factor.</w:t>
+      </w:r>
+    </w:p>
+    <w:p>
+      <w:pPr>
+        <w:pStyle w:val="SourceCode"/>
+      </w:pPr>
+      <w:r>
+        <w:rPr>
+          <w:rStyle w:val="VerbatimChar"/>
+        </w:rPr>
+        <w:t xml:space="preserve">Levene's Test for Homogeneity of Variance (center = median)</w:t>
+      </w:r>
+      <w:r>
+        <w:br/>
+      </w:r>
+      <w:r>
+        <w:rPr>
+          <w:rStyle w:val="VerbatimChar"/>
+        </w:rPr>
+        <w:t xml:space="preserve">       Df F value Pr(&gt;F)</w:t>
+      </w:r>
+      <w:r>
+        <w:br/>
+      </w:r>
+      <w:r>
+        <w:rPr>
+          <w:rStyle w:val="VerbatimChar"/>
+        </w:rPr>
+        <w:t xml:space="preserve">group   1   2.029 0.1572</w:t>
+      </w:r>
+      <w:r>
+        <w:br/>
+      </w:r>
+      <w:r>
+        <w:rPr>
+          <w:rStyle w:val="VerbatimChar"/>
+        </w:rPr>
+        <w:t xml:space="preserve">      108               </w:t>
+      </w:r>
+    </w:p>
+    <w:bookmarkEnd w:id="52"/>
+    <w:bookmarkEnd w:id="53"/>
+    <w:bookmarkStart w:id="54" w:name="interpretation-of-assumption-tests"/>
+    <w:p>
+      <w:pPr>
+        <w:pStyle w:val="Heading2"/>
+      </w:pPr>
+      <w:r>
+        <w:t xml:space="preserve">Interpretation of Assumption Tests</w:t>
+      </w:r>
+    </w:p>
+    <w:p>
+      <w:pPr>
+        <w:pStyle w:val="FirstParagraph"/>
+      </w:pPr>
+      <w:r>
+        <w:t xml:space="preserve">Based on the results of our assumption tests:</w:t>
+      </w:r>
+    </w:p>
+    <w:p>
+      <w:pPr>
+        <w:numPr>
+          <w:ilvl w:val="0"/>
+          <w:numId w:val="1007"/>
+        </w:numPr>
+      </w:pPr>
+      <w:r>
         <w:rPr>
           <w:b/>
           <w:bCs/>
         </w:rPr>
-        <w:t xml:space="preserve">Normality</w:t>
-      </w:r>
-      <w:r>
-        <w:t xml:space="preserve">:</w:t>
-      </w:r>
-    </w:p>
-    <w:p>
-      <w:pPr>
-        <w:pStyle w:val="Compact"/>
+        <w:t xml:space="preserve">Independence</w:t>
+      </w:r>
+      <w:r>
+        <w:t xml:space="preserve">: We assume this is met based on the data collection</w:t>
+      </w:r>
+      <w:r>
+        <w:t xml:space="preserve"> </w:t>
+      </w:r>
+      <w:r>
+        <w:t xml:space="preserve">process, as samples from each lake were collected independently of</w:t>
+      </w:r>
+      <w:r>
+        <w:t xml:space="preserve"> </w:t>
+      </w:r>
+      <w:r>
+        <w:t xml:space="preserve">one another.</w:t>
+      </w:r>
+    </w:p>
+    <w:p>
+      <w:pPr>
         <w:numPr>
-          <w:ilvl w:val="1"/>
+          <w:ilvl w:val="0"/>
           <w:numId w:val="1007"/>
         </w:numPr>
       </w:pPr>
       <w:r>
-        <w:t xml:space="preserve">The Q-Q plots show that the data points largely follow the</w:t>
-      </w:r>
-      <w:r>
-        <w:t xml:space="preserve"> </w:t>
-      </w:r>
-      <w:r>
-        <w:t xml:space="preserve">theoretical normal distribution line for both lakes, with some</w:t>
-      </w:r>
-      <w:r>
-        <w:t xml:space="preserve"> </w:t>
-      </w:r>
-      <w:r>
-        <w:t xml:space="preserve">minor deviations at the extremes.</w:t>
-      </w:r>
-    </w:p>
-    <w:p>
-      <w:pPr>
-        <w:pStyle w:val="Compact"/>
-        <w:numPr>
-          <w:ilvl w:val="1"/>
-          <w:numId w:val="1007"/>
-        </w:numPr>
-      </w:pPr>
-      <w:r>
-        <w:t xml:space="preserve">The Shapiro-Wilk test results will help us formally assess</w:t>
-      </w:r>
-      <w:r>
-        <w:t xml:space="preserve"> </w:t>
-      </w:r>
-      <w:r>
-        <w:t xml:space="preserve">normality. If the p-value is greater than 0.05, we fail to</w:t>
-      </w:r>
-      <w:r>
-        <w:t xml:space="preserve"> </w:t>
-      </w:r>
-      <w:r>
-        <w:t xml:space="preserve">reject the null hypothesis that the data is normally</w:t>
-      </w:r>
-      <w:r>
-        <w:t xml:space="preserve"> </w:t>
-      </w:r>
-      <w:r>
-        <w:t xml:space="preserve">distributed.</w:t>
-      </w:r>
-    </w:p>
-    <w:p>
-      <w:pPr>
-        <w:pStyle w:val="Compact"/>
-        <w:numPr>
-          <w:ilvl w:val="1"/>
-          <w:numId w:val="1007"/>
-        </w:numPr>
-      </w:pPr>
-      <w:r>
-        <w:t xml:space="preserve">For samples larger than 30, the Central Limit Theorem suggests</w:t>
-      </w:r>
-      <w:r>
-        <w:t xml:space="preserve"> </w:t>
-      </w:r>
-      <w:r>
-        <w:t xml:space="preserve">that the sampling distribution of means will be approximately</w:t>
-      </w:r>
-      <w:r>
-        <w:t xml:space="preserve"> </w:t>
-      </w:r>
-      <w:r>
-        <w:t xml:space="preserve">normal regardless of the underlying distribution.</w:t>
-      </w:r>
-    </w:p>
-    <w:p>
-      <w:pPr>
-        <w:numPr>
-          <w:ilvl w:val="0"/>
-          <w:numId w:val="1006"/>
-        </w:numPr>
-      </w:pPr>
-      <w:r>
         <w:rPr>
           <w:b/>
           <w:bCs/>
         </w:rPr>
-        <w:t xml:space="preserve">Homogeneity of Variances</w:t>
+        <w:t xml:space="preserve">Normality</w:t>
       </w:r>
       <w:r>
         <w:t xml:space="preserve">:</w:t>
@@ -9022,13 +9145,19 @@
         </w:numPr>
       </w:pPr>
       <w:r>
-        <w:t xml:space="preserve">Levene’s test evaluates whether the variances between groups are</w:t>
-      </w:r>
-      <w:r>
-        <w:t xml:space="preserve"> </w:t>
-      </w:r>
-      <w:r>
-        <w:t xml:space="preserve">equal.</w:t>
+        <w:t xml:space="preserve">The Q-Q plots show that the data points largely follow the</w:t>
+      </w:r>
+      <w:r>
+        <w:t xml:space="preserve"> </w:t>
+      </w:r>
+      <w:r>
+        <w:t xml:space="preserve">theoretical normal distribution line for both lakes, with some</w:t>
+      </w:r>
+      <w:r>
+        <w:t xml:space="preserve"> </w:t>
+      </w:r>
+      <w:r>
+        <w:t xml:space="preserve">minor deviations at the extremes.</w:t>
       </w:r>
     </w:p>
     <w:p>
@@ -9040,13 +9169,25 @@
         </w:numPr>
       </w:pPr>
       <w:r>
-        <w:t xml:space="preserve">A p-value greater than 0.05 indicates that we cannot reject the</w:t>
-      </w:r>
-      <w:r>
-        <w:t xml:space="preserve"> </w:t>
-      </w:r>
-      <w:r>
-        <w:t xml:space="preserve">null hypothesis of equal variances.</w:t>
+        <w:t xml:space="preserve">The Shapiro-Wilk test results will help us formally assess</w:t>
+      </w:r>
+      <w:r>
+        <w:t xml:space="preserve"> </w:t>
+      </w:r>
+      <w:r>
+        <w:t xml:space="preserve">normality. If the p-value is greater than 0.05, we fail to</w:t>
+      </w:r>
+      <w:r>
+        <w:t xml:space="preserve"> </w:t>
+      </w:r>
+      <w:r>
+        <w:t xml:space="preserve">reject the null hypothesis that the data is normally</w:t>
+      </w:r>
+      <w:r>
+        <w:t xml:space="preserve"> </w:t>
+      </w:r>
+      <w:r>
+        <w:t xml:space="preserve">distributed.</w:t>
       </w:r>
     </w:p>
     <w:p>
@@ -9058,13 +9199,37 @@
         </w:numPr>
       </w:pPr>
       <w:r>
-        <w:t xml:space="preserve">As a rule of thumb, if the variance ratio is less than 4:1, the</w:t>
-      </w:r>
-      <w:r>
-        <w:t xml:space="preserve"> </w:t>
-      </w:r>
-      <w:r>
-        <w:t xml:space="preserve">t-test is reasonably robust to violations of this assumption.</w:t>
+        <w:t xml:space="preserve">For samples larger than 30, the Central Limit Theorem suggests</w:t>
+      </w:r>
+      <w:r>
+        <w:t xml:space="preserve"> </w:t>
+      </w:r>
+      <w:r>
+        <w:t xml:space="preserve">that the sampling distribution of means will be approximately</w:t>
+      </w:r>
+      <w:r>
+        <w:t xml:space="preserve"> </w:t>
+      </w:r>
+      <w:r>
+        <w:t xml:space="preserve">normal regardless of the underlying distribution.</w:t>
+      </w:r>
+    </w:p>
+    <w:p>
+      <w:pPr>
+        <w:numPr>
+          <w:ilvl w:val="0"/>
+          <w:numId w:val="1007"/>
+        </w:numPr>
+      </w:pPr>
+      <w:r>
+        <w:rPr>
+          <w:b/>
+          <w:bCs/>
+        </w:rPr>
+        <w:t xml:space="preserve">Homogeneity of Variances</w:t>
+      </w:r>
+      <w:r>
+        <w:t xml:space="preserve">:</w:t>
       </w:r>
     </w:p>
     <w:p>
@@ -9072,10 +9237,64 @@
         <w:pStyle w:val="Compact"/>
         <w:numPr>
           <w:ilvl w:val="1"/>
-          <w:numId w:val="1008"/>
+          <w:numId w:val="1009"/>
         </w:numPr>
       </w:pPr>
       <w:r>
+        <w:t xml:space="preserve">Levene’s test evaluates whether the variances between groups are</w:t>
+      </w:r>
+      <w:r>
+        <w:t xml:space="preserve"> </w:t>
+      </w:r>
+      <w:r>
+        <w:t xml:space="preserve">equal.</w:t>
+      </w:r>
+    </w:p>
+    <w:p>
+      <w:pPr>
+        <w:pStyle w:val="Compact"/>
+        <w:numPr>
+          <w:ilvl w:val="1"/>
+          <w:numId w:val="1009"/>
+        </w:numPr>
+      </w:pPr>
+      <w:r>
+        <w:t xml:space="preserve">A p-value greater than 0.05 indicates that we cannot reject the</w:t>
+      </w:r>
+      <w:r>
+        <w:t xml:space="preserve"> </w:t>
+      </w:r>
+      <w:r>
+        <w:t xml:space="preserve">null hypothesis of equal variances.</w:t>
+      </w:r>
+    </w:p>
+    <w:p>
+      <w:pPr>
+        <w:pStyle w:val="Compact"/>
+        <w:numPr>
+          <w:ilvl w:val="1"/>
+          <w:numId w:val="1009"/>
+        </w:numPr>
+      </w:pPr>
+      <w:r>
+        <w:t xml:space="preserve">As a rule of thumb, if the variance ratio is less than 4:1, the</w:t>
+      </w:r>
+      <w:r>
+        <w:t xml:space="preserve"> </w:t>
+      </w:r>
+      <w:r>
+        <w:t xml:space="preserve">t-test is reasonably robust to violations of this assumption.</w:t>
+      </w:r>
+    </w:p>
+    <w:p>
+      <w:pPr>
+        <w:pStyle w:val="Compact"/>
+        <w:numPr>
+          <w:ilvl w:val="1"/>
+          <w:numId w:val="1009"/>
+        </w:numPr>
+      </w:pPr>
+      <w:r>
         <w:t xml:space="preserve">If this assumption is violated, we should consider using Welch’s</w:t>
       </w:r>
       <w:r>
@@ -9085,9 +9304,9 @@
         <w:t xml:space="preserve">t-test instead, which does not assume equal variances.</w:t>
       </w:r>
     </w:p>
-    <w:bookmarkEnd w:id="53"/>
     <w:bookmarkEnd w:id="54"/>
-    <w:bookmarkStart w:id="63" w:name="two-sample-t-test"/>
+    <w:bookmarkEnd w:id="55"/>
+    <w:bookmarkStart w:id="64" w:name="two-sample-t-test"/>
     <w:p>
       <w:pPr>
         <w:pStyle w:val="Heading1"/>
@@ -9592,7 +9811,7 @@
         <w:t xml:space="preserve">           47.27027            55.56164 </w:t>
       </w:r>
     </w:p>
-    <w:bookmarkStart w:id="55" w:name="Xa30e1033041c0a19bd968f1658f7583eb9deb3b"/>
+    <w:bookmarkStart w:id="56" w:name="Xa30e1033041c0a19bd968f1658f7583eb9deb3b"/>
     <w:p>
       <w:pPr>
         <w:pStyle w:val="Heading2"/>
@@ -9614,7 +9833,7 @@
         <w:pStyle w:val="Compact"/>
         <w:numPr>
           <w:ilvl w:val="0"/>
-          <w:numId w:val="1009"/>
+          <w:numId w:val="1010"/>
         </w:numPr>
       </w:pPr>
       <w:r>
@@ -9633,7 +9852,7 @@
         <w:pStyle w:val="Compact"/>
         <w:numPr>
           <w:ilvl w:val="0"/>
-          <w:numId w:val="1009"/>
+          <w:numId w:val="1010"/>
         </w:numPr>
       </w:pPr>
       <w:r>
@@ -9673,7 +9892,7 @@
         <w:pStyle w:val="Compact"/>
         <w:numPr>
           <w:ilvl w:val="0"/>
-          <w:numId w:val="1009"/>
+          <w:numId w:val="1010"/>
         </w:numPr>
       </w:pPr>
       <w:r>
@@ -9692,7 +9911,7 @@
         <w:pStyle w:val="Compact"/>
         <w:numPr>
           <w:ilvl w:val="0"/>
-          <w:numId w:val="1009"/>
+          <w:numId w:val="1010"/>
         </w:numPr>
       </w:pPr>
       <w:r>
@@ -9711,7 +9930,7 @@
         <w:pStyle w:val="Compact"/>
         <w:numPr>
           <w:ilvl w:val="0"/>
-          <w:numId w:val="1009"/>
+          <w:numId w:val="1010"/>
         </w:numPr>
       </w:pPr>
       <w:r>
@@ -9730,7 +9949,7 @@
         <w:pStyle w:val="Compact"/>
         <w:numPr>
           <w:ilvl w:val="0"/>
-          <w:numId w:val="1009"/>
+          <w:numId w:val="1010"/>
         </w:numPr>
       </w:pPr>
       <w:r>
@@ -9755,7 +9974,7 @@
         <w:pStyle w:val="Compact"/>
         <w:numPr>
           <w:ilvl w:val="0"/>
-          <w:numId w:val="1009"/>
+          <w:numId w:val="1010"/>
         </w:numPr>
       </w:pPr>
       <w:r>
@@ -9774,7 +9993,7 @@
         <w:pStyle w:val="Compact"/>
         <w:numPr>
           <w:ilvl w:val="0"/>
-          <w:numId w:val="1009"/>
+          <w:numId w:val="1010"/>
         </w:numPr>
       </w:pPr>
       <w:r>
@@ -9799,7 +10018,7 @@
         <w:pStyle w:val="Compact"/>
         <w:numPr>
           <w:ilvl w:val="0"/>
-          <w:numId w:val="1009"/>
+          <w:numId w:val="1010"/>
         </w:numPr>
       </w:pPr>
       <w:r>
@@ -9813,8 +10032,8 @@
         <w:t xml:space="preserve">: The means of each group</w:t>
       </w:r>
     </w:p>
-    <w:bookmarkEnd w:id="55"/>
-    <w:bookmarkStart w:id="62" w:name="visual-representation-of-t-test-results"/>
+    <w:bookmarkEnd w:id="56"/>
+    <w:bookmarkStart w:id="63" w:name="visual-representation-of-t-test-results"/>
     <w:p>
       <w:pPr>
         <w:pStyle w:val="Heading2"/>
@@ -10477,20 +10696,20 @@
       <w:r>
         <w:drawing>
           <wp:inline>
-            <wp:extent cx="6096000" cy="7315200"/>
+            <wp:extent cx="3657600" cy="4876800"/>
             <wp:effectExtent b="0" l="0" r="0" t="0"/>
-            <wp:docPr descr="" title="" id="57" name="Picture"/>
+            <wp:docPr descr="" title="" id="58" name="Picture"/>
             <a:graphic>
               <a:graphicData uri="http://schemas.openxmlformats.org/drawingml/2006/picture">
                 <pic:pic>
                   <pic:nvPicPr>
-                    <pic:cNvPr descr="01_two_sample_ttest_files/figure-docx/unnamed-chunk-14-1.png" id="58" name="Picture"/>
+                    <pic:cNvPr descr="01_two_sample_ttest_files/figure-docx/final_histo_plot-1.png" id="59" name="Picture"/>
                     <pic:cNvPicPr>
                       <a:picLocks noChangeArrowheads="1" noChangeAspect="1"/>
                     </pic:cNvPicPr>
                   </pic:nvPicPr>
                   <pic:blipFill>
-                    <a:blip r:embed="rId56"/>
+                    <a:blip r:embed="rId57"/>
                     <a:stretch>
                       <a:fillRect/>
                     </a:stretch>
@@ -10498,7 +10717,7 @@
                   <pic:spPr bwMode="auto">
                     <a:xfrm>
                       <a:off x="0" y="0"/>
-                      <a:ext cx="6096000" cy="7315200"/>
+                      <a:ext cx="3657600" cy="4876800"/>
                     </a:xfrm>
                     <a:prstGeom prst="rect">
                       <a:avLst/>
@@ -11291,20 +11510,20 @@
       <w:r>
         <w:drawing>
           <wp:inline>
-            <wp:extent cx="6096000" cy="7315200"/>
+            <wp:extent cx="3657600" cy="4876800"/>
             <wp:effectExtent b="0" l="0" r="0" t="0"/>
-            <wp:docPr descr="" title="" id="60" name="Picture"/>
+            <wp:docPr descr="" title="" id="61" name="Picture"/>
             <a:graphic>
               <a:graphicData uri="http://schemas.openxmlformats.org/drawingml/2006/picture">
                 <pic:pic>
                   <pic:nvPicPr>
-                    <pic:cNvPr descr="01_two_sample_ttest_files/figure-docx/unnamed-chunk-15-1.png" id="61" name="Picture"/>
+                    <pic:cNvPr descr="01_two_sample_ttest_files/figure-docx/final_mean_se-1.png" id="62" name="Picture"/>
                     <pic:cNvPicPr>
                       <a:picLocks noChangeArrowheads="1" noChangeAspect="1"/>
                     </pic:cNvPicPr>
                   </pic:nvPicPr>
                   <pic:blipFill>
-                    <a:blip r:embed="rId59"/>
+                    <a:blip r:embed="rId60"/>
                     <a:stretch>
                       <a:fillRect/>
                     </a:stretch>
@@ -11312,7 +11531,7 @@
                   <pic:spPr bwMode="auto">
                     <a:xfrm>
                       <a:off x="0" y="0"/>
-                      <a:ext cx="6096000" cy="7315200"/>
+                      <a:ext cx="3657600" cy="4876800"/>
                     </a:xfrm>
                     <a:prstGeom prst="rect">
                       <a:avLst/>
@@ -11331,9 +11550,9 @@
         </w:drawing>
       </w:r>
     </w:p>
-    <w:bookmarkEnd w:id="62"/>
     <w:bookmarkEnd w:id="63"/>
-    <w:bookmarkStart w:id="65" w:name="conclusion-and-scientific-reporting"/>
+    <w:bookmarkEnd w:id="64"/>
+    <w:bookmarkStart w:id="66" w:name="conclusion-and-scientific-reporting"/>
     <w:p>
       <w:pPr>
         <w:pStyle w:val="Heading1"/>
@@ -11852,7 +12071,7 @@
         <w:t xml:space="preserve">than those from Lake NE 14 (mean ± SE: mm).</w:t>
       </w:r>
     </w:p>
-    <w:bookmarkStart w:id="64" w:name="X24e75fa51be412e36dc63f64aded42fd0bd54cb"/>
+    <w:bookmarkStart w:id="65" w:name="X24e75fa51be412e36dc63f64aded42fd0bd54cb"/>
     <w:p>
       <w:pPr>
         <w:pStyle w:val="Heading2"/>
@@ -11953,7 +12172,7 @@
         <w:pStyle w:val="Compact"/>
         <w:numPr>
           <w:ilvl w:val="0"/>
-          <w:numId w:val="1010"/>
+          <w:numId w:val="1011"/>
         </w:numPr>
       </w:pPr>
       <w:r>
@@ -11965,7 +12184,7 @@
         <w:pStyle w:val="Compact"/>
         <w:numPr>
           <w:ilvl w:val="0"/>
-          <w:numId w:val="1010"/>
+          <w:numId w:val="1011"/>
         </w:numPr>
       </w:pPr>
       <w:r>
@@ -11977,7 +12196,7 @@
         <w:pStyle w:val="Compact"/>
         <w:numPr>
           <w:ilvl w:val="0"/>
-          <w:numId w:val="1010"/>
+          <w:numId w:val="1011"/>
         </w:numPr>
       </w:pPr>
       <w:r>
@@ -11989,7 +12208,7 @@
         <w:pStyle w:val="Compact"/>
         <w:numPr>
           <w:ilvl w:val="0"/>
-          <w:numId w:val="1010"/>
+          <w:numId w:val="1011"/>
         </w:numPr>
       </w:pPr>
       <w:r>
@@ -12038,8 +12257,8 @@
         <w:t xml:space="preserve">&lt; 0.001).”</w:t>
       </w:r>
     </w:p>
-    <w:bookmarkEnd w:id="64"/>
     <w:bookmarkEnd w:id="65"/>
+    <w:bookmarkEnd w:id="66"/>
     <w:sectPr>
       <w:pgSz w:h="15840" w:w="12240"/>
       <w:pgMar w:bottom="720" w:footer="720" w:gutter="0" w:header="720" w:left="1152" w:right="720" w:top="720"/>
@@ -12385,6 +12604,9 @@
     <w:abstractNumId w:val="991"/>
   </w:num>
   <w:num w:numId="1006">
+    <w:abstractNumId w:val="991"/>
+  </w:num>
+  <w:num w:numId="1007">
     <w:abstractNumId w:val="99411"/>
     <w:lvlOverride w:ilvl="0">
       <w:startOverride w:val="1"/>
@@ -12414,13 +12636,13 @@
       <w:startOverride w:val="1"/>
     </w:lvlOverride>
   </w:num>
-  <w:num w:numId="1007">
-    <w:abstractNumId w:val="991"/>
-  </w:num>
   <w:num w:numId="1008">
     <w:abstractNumId w:val="991"/>
   </w:num>
   <w:num w:numId="1009">
+    <w:abstractNumId w:val="991"/>
+  </w:num>
+  <w:num w:numId="1010">
     <w:abstractNumId w:val="99411"/>
     <w:lvlOverride w:ilvl="0">
       <w:startOverride w:val="1"/>
@@ -12450,7 +12672,7 @@
       <w:startOverride w:val="1"/>
     </w:lvlOverride>
   </w:num>
-  <w:num w:numId="1010">
+  <w:num w:numId="1011">
     <w:abstractNumId w:val="99411"/>
     <w:lvlOverride w:ilvl="0">
       <w:startOverride w:val="1"/>

</xml_diff>